<commit_message>
Add User Guide sections (Purpose, Target Audience, Getting Started, Installation)
</commit_message>
<xml_diff>
--- a/docs/Phase 2 source_Final.docx
+++ b/docs/Phase 2 source_Final.docx
@@ -704,6 +704,9 @@
         <w:br/>
       </w:r>
       <w:r>
+        <w:rPr>
+          <w:noProof/>
+        </w:rPr>
         <w:lastRenderedPageBreak/>
         <w:drawing>
           <wp:inline distT="0" distB="0" distL="0" distR="0" wp14:anchorId="4E2566A5" wp14:editId="6F674CA5">
@@ -1497,6 +1500,9 @@
     </w:p>
     <w:p>
       <w:r>
+        <w:rPr>
+          <w:noProof/>
+        </w:rPr>
         <w:drawing>
           <wp:inline distT="0" distB="0" distL="0" distR="0" wp14:anchorId="33574A4E" wp14:editId="0BC414D5">
             <wp:extent cx="5943600" cy="4680585"/>
@@ -1792,6 +1798,9 @@
     </w:p>
     <w:p>
       <w:r>
+        <w:rPr>
+          <w:noProof/>
+        </w:rPr>
         <w:drawing>
           <wp:inline distT="0" distB="0" distL="0" distR="0" wp14:anchorId="53D540CF" wp14:editId="20B6CDC0">
             <wp:extent cx="5943600" cy="1704340"/>

</xml_diff>